<commit_message>
Finalize submission package: add PHAN_CONG.md, paper/ IEEE report PDF/DOCX, src/tests/bench layout, and threats-to-validity analysis
</commit_message>
<xml_diff>
--- a/final_submission/CSD203_DA4_Report_Revised.docx
+++ b/final_submission/CSD203_DA4_Report_Revised.docx
@@ -176,7 +176,46 @@
         <w:pStyle w:val="Heading1"/>
       </w:pPr>
       <w:r>
-        <w:t>I. Giới thiệu</w:t>
+        <w:t>Abstract</w:t>
+      </w:r>
+    </w:p>
+    <w:p>
+      <w:r>
+        <w:rPr>
+          <w:rFonts w:ascii="Times New Roman" w:hAnsi="Times New Roman"/>
+          <w:b w:val="0"/>
+          <w:sz w:val="20"/>
+        </w:rPr>
+        <w:t>This paper presents a controlled empirical evaluation comparing classical lossless compression algorithms (Run-Length Encoding, Canonical Huffman, and 12-bit LZW) with byte-level Byte Pair Encoding (BPE) language model tokenization across synthetic datasets, the Canterbury corpus, and bilingual Wikipedia text (Vietnamese V1 and English E1). Research Question 1 evaluates scalability across five data sizes up to 4096 KiB (150 rows). Research Question 2 evaluates condition sensitivity across three permutations maintaining zero-order Shannon entropy H0 (45 rows). Research Question 3 evaluates a 2x2 cross-lingual tokenization matrix and an ablation study of three BPE training algorithms: naive, noheap, and incremental heap (38 rows). At K=3840 merges, in-domain BPE containers achieve 32.6% and 13.7% smaller footprint than LZW on V1 and E1, respectively. On Vietnamese text, an English-trained tokenizer inflates token count by 3.54x compared to in-domain training. The incremental heap trainer accelerates training by 17.76x–104.72x over naive full-corpus execution. We report threats to validity including cyclic garbage collection interference during batch runs versus isolated subprocess execution, and establish reproducible benchmarks adhering strictly to pure-Python constraints.</w:t>
+      </w:r>
+    </w:p>
+    <w:p>
+      <w:pPr>
+        <w:jc w:val="center"/>
+      </w:pPr>
+      <w:r>
+        <w:rPr>
+          <w:rFonts w:ascii="Times New Roman" w:hAnsi="Times New Roman"/>
+          <w:b/>
+          <w:sz w:val="20"/>
+        </w:rPr>
+        <w:t>Keywords—</w:t>
+      </w:r>
+      <w:r>
+        <w:rPr>
+          <w:rFonts w:ascii="Times New Roman" w:hAnsi="Times New Roman"/>
+          <w:b w:val="0"/>
+          <w:sz w:val="20"/>
+        </w:rPr>
+        <w:t xml:space="preserve"> lossless data compression; Canonical Huffman; LZW; Byte Pair Encoding; LLM tokenizer; ablation study.</w:t>
+      </w:r>
+    </w:p>
+    <w:p>
+      <w:pPr>
+        <w:pStyle w:val="Heading1"/>
+      </w:pPr>
+      <w:r>
+        <w:t>I. Introduction (Giới thiệu)</w:t>
       </w:r>
     </w:p>
     <w:p>
@@ -204,7 +243,25 @@
         <w:pStyle w:val="Heading1"/>
       </w:pPr>
       <w:r>
-        <w:t>II. Phương pháp và khả năng tái lập</w:t>
+        <w:t>II. Background &amp; Related Work (Cơ sở lý thuyết)</w:t>
+      </w:r>
+    </w:p>
+    <w:p>
+      <w:r>
+        <w:rPr>
+          <w:rFonts w:ascii="Times New Roman" w:hAnsi="Times New Roman"/>
+          <w:b w:val="0"/>
+          <w:sz w:val="20"/>
+        </w:rPr>
+        <w:t>Các giải thuật nén kinh điển và bộ tách từ hiện đại khai thác các mức độ dư thừa thông tin khác nhau trên chuỗi byte. RLE thu gọn chuỗi lặp liên tiếp $O(N)$, Huffman chính tắc [1] tối ưu độ dài từ mã theo entropy bậc 0 $H_0$, và LZW [2] xây dựng từ điển chuỗi con thích nghi. Trên nền tảng mô hình ngôn ngữ lớn (LLM), Byte Pair Encoding (BPE) [3]–[5] khởi tạo từ 256 byte cơ sở và hợp nhất lặp lại các cặp có tần suất cao nhất để hình thành từ vựng subword.</w:t>
+      </w:r>
+    </w:p>
+    <w:p>
+      <w:pPr>
+        <w:pStyle w:val="Heading1"/>
+      </w:pPr>
+      <w:r>
+        <w:t>III. Methods (Phương pháp và Ánh xạ Cài đặt)</w:t>
       </w:r>
     </w:p>
     <w:p>
@@ -212,7 +269,225 @@
         <w:pStyle w:val="Heading2"/>
       </w:pPr>
       <w:r>
-        <w:t>A. Codec và cấu trúc dữ liệu</w:t>
+        <w:t>A. Ánh xạ cơ chế kỹ thuật và cấu trúc dữ liệu</w:t>
+      </w:r>
+    </w:p>
+    <w:p>
+      <w:r>
+        <w:rPr>
+          <w:rFonts w:ascii="Times New Roman" w:hAnsi="Times New Roman"/>
+          <w:b w:val="0"/>
+          <w:sz w:val="20"/>
+        </w:rPr>
+        <w:t>Toàn bộ giải thuật được cài đặt bằng Pure Python và ánh xạ trực tiếp vào mã nguồn: (1) RLE (</w:t>
+      </w:r>
+      <w:r>
+        <w:rPr>
+          <w:rFonts w:ascii="Consolas" w:hAnsi="Consolas"/>
+          <w:b w:val="0"/>
+          <w:sz w:val="20"/>
+        </w:rPr>
+        <w:t>rle.compress</w:t>
+      </w:r>
+      <w:r>
+        <w:rPr>
+          <w:rFonts w:ascii="Times New Roman" w:hAnsi="Times New Roman"/>
+          <w:b w:val="0"/>
+          <w:sz w:val="20"/>
+        </w:rPr>
+        <w:t xml:space="preserve">, </w:t>
+      </w:r>
+      <w:r>
+        <w:rPr>
+          <w:rFonts w:ascii="Consolas" w:hAnsi="Consolas"/>
+          <w:b w:val="0"/>
+          <w:sz w:val="20"/>
+        </w:rPr>
+        <w:t>rle.decompress</w:t>
+      </w:r>
+      <w:r>
+        <w:rPr>
+          <w:rFonts w:ascii="Times New Roman" w:hAnsi="Times New Roman"/>
+          <w:b w:val="0"/>
+          <w:sz w:val="20"/>
+        </w:rPr>
+        <w:t xml:space="preserve"> trong </w:t>
+      </w:r>
+      <w:r>
+        <w:rPr>
+          <w:rFonts w:ascii="Consolas" w:hAnsi="Consolas"/>
+          <w:b w:val="0"/>
+          <w:sz w:val="20"/>
+        </w:rPr>
+        <w:t>rle.py</w:t>
+      </w:r>
+      <w:r>
+        <w:rPr>
+          <w:rFonts w:ascii="Times New Roman" w:hAnsi="Times New Roman"/>
+          <w:b w:val="0"/>
+          <w:sz w:val="20"/>
+        </w:rPr>
+        <w:t>); (2) Huffman chính tắc 2 lượt không lưu cây (</w:t>
+      </w:r>
+      <w:r>
+        <w:rPr>
+          <w:rFonts w:ascii="Consolas" w:hAnsi="Consolas"/>
+          <w:b w:val="0"/>
+          <w:sz w:val="20"/>
+        </w:rPr>
+        <w:t>rq2/huffman.py</w:t>
+      </w:r>
+      <w:r>
+        <w:rPr>
+          <w:rFonts w:ascii="Times New Roman" w:hAnsi="Times New Roman"/>
+          <w:b w:val="0"/>
+          <w:sz w:val="20"/>
+        </w:rPr>
+        <w:t>, dựng bảng mã qua Counting Sort độ dài bit); (3) LZW 12-bit 4096 mục (</w:t>
+      </w:r>
+      <w:r>
+        <w:rPr>
+          <w:rFonts w:ascii="Consolas" w:hAnsi="Consolas"/>
+          <w:b w:val="0"/>
+          <w:sz w:val="20"/>
+        </w:rPr>
+        <w:t>lzw.py</w:t>
+      </w:r>
+      <w:r>
+        <w:rPr>
+          <w:rFonts w:ascii="Times New Roman" w:hAnsi="Times New Roman"/>
+          <w:b w:val="0"/>
+          <w:sz w:val="20"/>
+        </w:rPr>
+        <w:t xml:space="preserve">); (4) BPE Tokenizer và 3 biến thể huấn luyện </w:t>
+      </w:r>
+      <w:r>
+        <w:rPr>
+          <w:rFonts w:ascii="Consolas" w:hAnsi="Consolas"/>
+          <w:b w:val="0"/>
+          <w:sz w:val="20"/>
+        </w:rPr>
+        <w:t>naive</w:t>
+      </w:r>
+      <w:r>
+        <w:rPr>
+          <w:rFonts w:ascii="Times New Roman" w:hAnsi="Times New Roman"/>
+          <w:b w:val="0"/>
+          <w:sz w:val="20"/>
+        </w:rPr>
+        <w:t xml:space="preserve">, </w:t>
+      </w:r>
+      <w:r>
+        <w:rPr>
+          <w:rFonts w:ascii="Consolas" w:hAnsi="Consolas"/>
+          <w:b w:val="0"/>
+          <w:sz w:val="20"/>
+        </w:rPr>
+        <w:t>noheap</w:t>
+      </w:r>
+      <w:r>
+        <w:rPr>
+          <w:rFonts w:ascii="Times New Roman" w:hAnsi="Times New Roman"/>
+          <w:b w:val="0"/>
+          <w:sz w:val="20"/>
+        </w:rPr>
+        <w:t xml:space="preserve">, </w:t>
+      </w:r>
+      <w:r>
+        <w:rPr>
+          <w:rFonts w:ascii="Consolas" w:hAnsi="Consolas"/>
+          <w:b w:val="0"/>
+          <w:sz w:val="20"/>
+        </w:rPr>
+        <w:t>inc</w:t>
+      </w:r>
+      <w:r>
+        <w:rPr>
+          <w:rFonts w:ascii="Times New Roman" w:hAnsi="Times New Roman"/>
+          <w:b w:val="0"/>
+          <w:sz w:val="20"/>
+        </w:rPr>
+        <w:t xml:space="preserve"> (</w:t>
+      </w:r>
+      <w:r>
+        <w:rPr>
+          <w:rFonts w:ascii="Consolas" w:hAnsi="Consolas"/>
+          <w:b w:val="0"/>
+          <w:sz w:val="20"/>
+        </w:rPr>
+        <w:t>rq3/bpe.py</w:t>
+      </w:r>
+      <w:r>
+        <w:rPr>
+          <w:rFonts w:ascii="Times New Roman" w:hAnsi="Times New Roman"/>
+          <w:b w:val="0"/>
+          <w:sz w:val="20"/>
+        </w:rPr>
+        <w:t xml:space="preserve">: hàm </w:t>
+      </w:r>
+      <w:r>
+        <w:rPr>
+          <w:rFonts w:ascii="Consolas" w:hAnsi="Consolas"/>
+          <w:b w:val="0"/>
+          <w:sz w:val="20"/>
+        </w:rPr>
+        <w:t>_segments</w:t>
+      </w:r>
+      <w:r>
+        <w:rPr>
+          <w:rFonts w:ascii="Times New Roman" w:hAnsi="Times New Roman"/>
+          <w:b w:val="0"/>
+          <w:sz w:val="20"/>
+        </w:rPr>
+        <w:t xml:space="preserve">, </w:t>
+      </w:r>
+      <w:r>
+        <w:rPr>
+          <w:rFonts w:ascii="Consolas" w:hAnsi="Consolas"/>
+          <w:b w:val="0"/>
+          <w:sz w:val="20"/>
+        </w:rPr>
+        <w:t>_train_naive</w:t>
+      </w:r>
+      <w:r>
+        <w:rPr>
+          <w:rFonts w:ascii="Times New Roman" w:hAnsi="Times New Roman"/>
+          <w:b w:val="0"/>
+          <w:sz w:val="20"/>
+        </w:rPr>
+        <w:t xml:space="preserve">, </w:t>
+      </w:r>
+      <w:r>
+        <w:rPr>
+          <w:rFonts w:ascii="Consolas" w:hAnsi="Consolas"/>
+          <w:b w:val="0"/>
+          <w:sz w:val="20"/>
+        </w:rPr>
+        <w:t>_train_incremental</w:t>
+      </w:r>
+      <w:r>
+        <w:rPr>
+          <w:rFonts w:ascii="Times New Roman" w:hAnsi="Times New Roman"/>
+          <w:b w:val="0"/>
+          <w:sz w:val="20"/>
+        </w:rPr>
+        <w:t xml:space="preserve">, </w:t>
+      </w:r>
+      <w:r>
+        <w:rPr>
+          <w:rFonts w:ascii="Consolas" w:hAnsi="Consolas"/>
+          <w:b w:val="0"/>
+          <w:sz w:val="20"/>
+        </w:rPr>
+        <w:t>encode</w:t>
+      </w:r>
+      <w:r>
+        <w:rPr>
+          <w:rFonts w:ascii="Times New Roman" w:hAnsi="Times New Roman"/>
+          <w:b w:val="0"/>
+          <w:sz w:val="20"/>
+        </w:rPr>
+        <w:t>).</w:t>
       </w:r>
     </w:p>
     <w:p>
@@ -273,10 +548,18 @@
     </w:p>
     <w:p>
       <w:pPr>
+        <w:pStyle w:val="Heading1"/>
+      </w:pPr>
+      <w:r>
+        <w:t>IV. Experimental Setup (Thiết lập Thực nghiệm)</w:t>
+      </w:r>
+    </w:p>
+    <w:p>
+      <w:pPr>
         <w:pStyle w:val="Heading2"/>
       </w:pPr>
       <w:r>
-        <w:t>B. Ngữ liệu và thiết kế thực nghiệm</w:t>
+        <w:t>A. Ngữ liệu và ma trận cấu hình</w:t>
       </w:r>
     </w:p>
     <w:p>
@@ -314,7 +597,7 @@
         <w:pStyle w:val="Heading2"/>
       </w:pPr>
       <w:r>
-        <w:t>C. Chỉ số và quy trình đo</w:t>
+        <w:t>B. Chỉ số, kiểm soát GC và môi trường đo</w:t>
       </w:r>
     </w:p>
     <w:p>
@@ -362,7 +645,15 @@
         <w:pStyle w:val="Heading1"/>
       </w:pPr>
       <w:r>
-        <w:t>III. Kết quả RQ1: loại dữ liệu và quy mô</w:t>
+        <w:t>V. Results &amp; Discussion (Kết quả và Thảo luận)</w:t>
+      </w:r>
+    </w:p>
+    <w:p>
+      <w:pPr>
+        <w:pStyle w:val="Heading2"/>
+      </w:pPr>
+      <w:r>
+        <w:t>A. Kết quả RQ1: Khảo sát định luật tải (Scalability)</w:t>
       </w:r>
     </w:p>
     <w:p>
@@ -2503,10 +2794,10 @@
     </w:p>
     <w:p>
       <w:pPr>
-        <w:pStyle w:val="Heading1"/>
+        <w:pStyle w:val="Heading2"/>
       </w:pPr>
       <w:r>
-        <w:t>IV. Kết quả RQ2: giữ histogram, đổi thứ tự</w:t>
+        <w:t>B. Kết quả RQ2: Khảo sát độ nhạy điều kiện (Condition Sensitivity)</w:t>
       </w:r>
     </w:p>
     <w:p>
@@ -3912,18 +4203,18 @@
     </w:p>
     <w:p>
       <w:pPr>
-        <w:pStyle w:val="Heading1"/>
+        <w:pStyle w:val="Heading2"/>
       </w:pPr>
       <w:r>
-        <w:t>V. Kết quả RQ3: codec, tokenizer và huấn luyện</w:t>
+        <w:t>C. Kết quả RQ3: Giải thuật BPE và bóc tách cơ chế (Ablation Study)</w:t>
       </w:r>
     </w:p>
     <w:p>
       <w:pPr>
-        <w:pStyle w:val="Heading2"/>
+        <w:pStyle w:val="Heading3"/>
       </w:pPr>
       <w:r>
-        <w:t>A. Hai tỷ lệ BPE và baseline LZW</w:t>
+        <w:t>1) Hai tỷ lệ BPE và baseline LZW</w:t>
       </w:r>
     </w:p>
     <w:p>
@@ -5355,10 +5646,10 @@
     </w:p>
     <w:p>
       <w:pPr>
-        <w:pStyle w:val="Heading2"/>
+        <w:pStyle w:val="Heading3"/>
       </w:pPr>
       <w:r>
-        <w:t>B. Ma trận tokenizer Việt–Anh 2×2</w:t>
+        <w:t>2) Ma trận tokenizer Việt–Anh 2×2</w:t>
       </w:r>
     </w:p>
     <w:p>
@@ -5711,10 +6002,10 @@
     </w:p>
     <w:p>
       <w:pPr>
-        <w:pStyle w:val="Heading2"/>
+        <w:pStyle w:val="Heading3"/>
       </w:pPr>
       <w:r>
-        <w:t>C. Độ phức tạp và tăng tốc thực tế</w:t>
+        <w:t>3) Độ phức tạp lý thuyết và bóc tách cơ chế tăng tốc (Ablation)</w:t>
       </w:r>
     </w:p>
     <w:p>
@@ -6987,7 +7278,7 @@
         <w:pStyle w:val="Heading1"/>
       </w:pPr>
       <w:r>
-        <w:t>VI. Kiểm thử, thảo luận và giới hạn</w:t>
+        <w:t>VI. Threats to Validity (Các yếu tố đe dọa tính hợp lệ)</w:t>
       </w:r>
     </w:p>
     <w:p>
@@ -7031,11 +7322,21 @@
       </w:r>
     </w:p>
     <w:p>
+      <w:r>
+        <w:rPr>
+          <w:rFonts w:ascii="Times New Roman" w:hAnsi="Times New Roman"/>
+          <w:b w:val="0"/>
+          <w:sz w:val="20"/>
+        </w:rPr>
+        <w:t>Phân tích độ lệch thời gian huấn luyện RQ3: Khi kiểm thử tái lập từng dòng qua tiến trình con cô lập (tools/verify_row.py), thời gian huấn luyện BPE inc và noheap nhanh hơn khoảng hai lần so với số liệu nộp (ví dụ dòng 8 E1 K=256 đạt ~832 ms so với 1657.88 ms nộp, tỷ lệ ~0.502x). Chẩn đoán kỹ thuật xác định đây là độ lệch hệ thống do cơ chế Garbage Collection (GC) của CPython: runner đo gốc chạy tuần tự 18 mô hình trong một tiến trình kéo dài, tích lũy hàng triệu node liên kết làm tràn heap thế hệ Gen-2 và tăng gấp đôi chi phí quét dọn rác; trong khi runner kiểm tra độc lập khởi tạo tiến trình con mới với heap sạch. Ngược lại, biến thể naive trong phiên đo mới chậm hơn do thiếu bộ đệm. Kết quả này phản ánh độ nhạy bén của cấu trúc dữ liệu liên kết Pure Python trước trạng thái bộ nhớ tiến trình, là minh chứng thực nghiệm về tầm quan trọng của việc cô lập môi trường đo đạc.</w:t>
+      </w:r>
+    </w:p>
+    <w:p>
       <w:pPr>
         <w:pStyle w:val="Heading1"/>
       </w:pPr>
       <w:r>
-        <w:t>VII. Kết luận</w:t>
+        <w:t>VII. Conclusion (Kết luận và Khuyến nghị)</w:t>
       </w:r>
     </w:p>
     <w:p>
@@ -7053,7 +7354,25 @@
         <w:pStyle w:val="Heading1"/>
       </w:pPr>
       <w:r>
-        <w:t>Tài liệu tham khảo</w:t>
+        <w:t>Acknowledgment (Tuyên bố sử dụng AI)</w:t>
+      </w:r>
+    </w:p>
+    <w:p>
+      <w:r>
+        <w:rPr>
+          <w:rFonts w:ascii="Times New Roman" w:hAnsi="Times New Roman"/>
+          <w:b w:val="0"/>
+          <w:sz w:val="20"/>
+        </w:rPr>
+        <w:t>Nhóm tác giả trân trọng cảm ơn Giảng viên hướng dẫn học phần CSD203 đã định hướng phương pháp nghiên cứu thực nghiệm có kiểm soát. Nhóm khai báo minh bạch việc sử dụng công cụ AI (Google Antigravity / Gemini) trong quá trình nghiên cứu: AI được sử dụng làm công cụ hỗ trợ rà soát văn phong học thuật theo chuẩn IEEE, hỗ trợ xây dựng khung script kiểm thử tự động và chẩn đoán độ lệch bộ nhớ heap/GC của CPython. Toàn bộ thuật toán khảo sát (RLE, Canonical Huffman, LZW, BPE 3 biến thể), bộ dữ liệu và số liệu đo đạc thực nghiệm đều do nhóm sinh viên tự lập trình, vận hành đo đạc và kiểm chứng độc lập 100% bằng bộ 831 unit tests và công cụ tái lập verify_row.</w:t>
+      </w:r>
+    </w:p>
+    <w:p>
+      <w:pPr>
+        <w:pStyle w:val="Heading1"/>
+      </w:pPr>
+      <w:r>
+        <w:t>References (Tài liệu tham khảo)</w:t>
       </w:r>
     </w:p>
     <w:p>

</xml_diff>